<commit_message>
Update Proyecto final Analítica.docx
</commit_message>
<xml_diff>
--- a/Proyecto final Analítica.docx
+++ b/Proyecto final Analítica.docx
@@ -1,6 +1,6 @@
 
 <file path=word/document.xml><?xml version="1.0" encoding="utf-8"?>
-<w:document xmlns:wpc="http://schemas.microsoft.com/office/word/2010/wordprocessingCanvas" xmlns:cx="http://schemas.microsoft.com/office/drawing/2014/chartex" xmlns:cx1="http://schemas.microsoft.com/office/drawing/2015/9/8/chartex" xmlns:cx2="http://schemas.microsoft.com/office/drawing/2015/10/21/chartex" xmlns:cx3="http://schemas.microsoft.com/office/drawing/2016/5/9/chartex" xmlns:cx4="http://schemas.microsoft.com/office/drawing/2016/5/10/chartex" xmlns:cx5="http://schemas.microsoft.com/office/drawing/2016/5/11/chartex" xmlns:cx6="http://schemas.microsoft.com/office/drawing/2016/5/12/chartex" xmlns:cx7="http://schemas.microsoft.com/office/drawing/2016/5/13/chartex" xmlns:cx8="http://schemas.microsoft.com/office/drawing/2016/5/14/chartex" xmlns:mc="http://schemas.openxmlformats.org/markup-compatibility/2006" xmlns:aink="http://schemas.microsoft.com/office/drawing/2016/ink" xmlns:am3d="http://schemas.microsoft.com/office/drawing/2017/model3d" xmlns:o="urn:schemas-microsoft-com:office:office" xmlns:oel="http://schemas.microsoft.com/office/2019/extlst" xmlns:r="http://schemas.openxmlformats.org/officeDocument/2006/relationships" xmlns:m="http://schemas.openxmlformats.org/officeDocument/2006/math" xmlns:v="urn:schemas-microsoft-com:vml" xmlns:wp14="http://schemas.microsoft.com/office/word/2010/wordprocessingDrawing" xmlns:wp="http://schemas.openxmlformats.org/drawingml/2006/wordprocessingDrawing" xmlns:w10="urn:schemas-microsoft-com:office:word" xmlns:w="http://schemas.openxmlformats.org/wordprocessingml/2006/main" xmlns:w14="http://schemas.microsoft.com/office/word/2010/wordml" xmlns:w15="http://schemas.microsoft.com/office/word/2012/wordml" xmlns:w16cex="http://schemas.microsoft.com/office/word/2018/wordml/cex" xmlns:w16cid="http://schemas.microsoft.com/office/word/2016/wordml/cid" xmlns:w16="http://schemas.microsoft.com/office/word/2018/wordml" xmlns:w16du="http://schemas.microsoft.com/office/word/2023/wordml/word16du" xmlns:w16sdtdh="http://schemas.microsoft.com/office/word/2020/wordml/sdtdatahash" xmlns:w16sdtfl="http://schemas.microsoft.com/office/word/2024/wordml/sdtformatlock" xmlns:w16se="http://schemas.microsoft.com/office/word/2015/wordml/symex" xmlns:wpg="http://schemas.microsoft.com/office/word/2010/wordprocessingGroup" xmlns:wpi="http://schemas.microsoft.com/office/word/2010/wordprocessingInk" xmlns:wne="http://schemas.microsoft.com/office/word/2006/wordml" xmlns:wps="http://schemas.microsoft.com/office/word/2010/wordprocessingShape" mc:Ignorable="w14 w15 w16se w16cid w16 w16cex w16sdtdh w16sdtfl w16du wp14">
+<w:document xmlns:wpc="http://schemas.microsoft.com/office/word/2010/wordprocessingCanvas" xmlns:cx="http://schemas.microsoft.com/office/drawing/2014/chartex" xmlns:cx1="http://schemas.microsoft.com/office/drawing/2015/9/8/chartex" xmlns:cx2="http://schemas.microsoft.com/office/drawing/2015/10/21/chartex" xmlns:cx3="http://schemas.microsoft.com/office/drawing/2016/5/9/chartex" xmlns:cx4="http://schemas.microsoft.com/office/drawing/2016/5/10/chartex" xmlns:cx5="http://schemas.microsoft.com/office/drawing/2016/5/11/chartex" xmlns:cx6="http://schemas.microsoft.com/office/drawing/2016/5/12/chartex" xmlns:cx7="http://schemas.microsoft.com/office/drawing/2016/5/13/chartex" xmlns:cx8="http://schemas.microsoft.com/office/drawing/2016/5/14/chartex" xmlns:mc="http://schemas.openxmlformats.org/markup-compatibility/2006" xmlns:aink="http://schemas.microsoft.com/office/drawing/2016/ink" xmlns:am3d="http://schemas.microsoft.com/office/drawing/2017/model3d" xmlns:o="urn:schemas-microsoft-com:office:office" xmlns:r="http://schemas.openxmlformats.org/officeDocument/2006/relationships" xmlns:m="http://schemas.openxmlformats.org/officeDocument/2006/math" xmlns:v="urn:schemas-microsoft-com:vml" xmlns:wp14="http://schemas.microsoft.com/office/word/2010/wordprocessingDrawing" xmlns:wp="http://schemas.openxmlformats.org/drawingml/2006/wordprocessingDrawing" xmlns:w10="urn:schemas-microsoft-com:office:word" xmlns:w="http://schemas.openxmlformats.org/wordprocessingml/2006/main" xmlns:w14="http://schemas.microsoft.com/office/word/2010/wordml" xmlns:w15="http://schemas.microsoft.com/office/word/2012/wordml" xmlns:w16cex="http://schemas.microsoft.com/office/word/2018/wordml/cex" xmlns:w16cid="http://schemas.microsoft.com/office/word/2016/wordml/cid" xmlns:w16="http://schemas.microsoft.com/office/word/2018/wordml" xmlns:w16se="http://schemas.microsoft.com/office/word/2015/wordml/symex" xmlns:wpg="http://schemas.microsoft.com/office/word/2010/wordprocessingGroup" xmlns:wpi="http://schemas.microsoft.com/office/word/2010/wordprocessingInk" xmlns:wne="http://schemas.microsoft.com/office/word/2006/wordml" xmlns:wps="http://schemas.microsoft.com/office/word/2010/wordprocessingShape" mc:Ignorable="w14 w15 w16se w16cid w16 w16cex wp14">
   <w:body>
     <w:p>
       <w:pPr>
@@ -650,7 +650,21 @@
         <w:rPr>
           <w:color w:val="000000"/>
         </w:rPr>
-        <w:t xml:space="preserve"> interactivo en Shiny que facilita la visualización y exploración de resultados para la toma de decisiones empresariales.</w:t>
+        <w:t xml:space="preserve"> interactivo en </w:t>
+      </w:r>
+      <w:proofErr w:type="spellStart"/>
+      <w:r>
+        <w:rPr>
+          <w:color w:val="000000"/>
+        </w:rPr>
+        <w:t>Shiny</w:t>
+      </w:r>
+      <w:proofErr w:type="spellEnd"/>
+      <w:r>
+        <w:rPr>
+          <w:color w:val="000000"/>
+        </w:rPr>
+        <w:t xml:space="preserve"> que facilita la visualización y exploración de resultados para la toma de decisiones empresariales.</w:t>
       </w:r>
     </w:p>
     <w:p>
@@ -2663,15 +2677,1696 @@
     </w:p>
     <w:p>
       <w:pPr>
+        <w:pStyle w:val="NormalWeb"/>
+        <w:spacing w:before="240" w:beforeAutospacing="0" w:after="240" w:afterAutospacing="0"/>
+        <w:jc w:val="both"/>
+        <w:rPr>
+          <w:lang w:eastAsia="en-US"/>
+        </w:rPr>
+      </w:pPr>
+      <w:r>
+        <w:rPr>
+          <w:color w:val="000000"/>
+        </w:rPr>
+        <w:t xml:space="preserve">Como se mencionó, la marca Brand_4 presenta un efecto negativo significativo sobre las ventas. Esto podría estar asociado a problemas de posicionamiento, menor percepción de calidad, estrategias de marketing poco efectivas, menor reconocimiento de marca y/o precios poco competitivos. Siendo así, el resultado evidencia una posible desventaja competitiva </w:t>
+      </w:r>
+      <w:r>
+        <w:rPr>
+          <w:color w:val="000000"/>
+        </w:rPr>
+        <w:lastRenderedPageBreak/>
+        <w:t>frente a las demás marcas analizadas.</w:t>
+      </w:r>
+      <w:r>
+        <w:rPr>
+          <w:color w:val="000000"/>
+        </w:rPr>
+        <w:t xml:space="preserve"> </w:t>
+      </w:r>
+      <w:r>
+        <w:rPr>
+          <w:noProof/>
+          <w:color w:val="000000"/>
+        </w:rPr>
+        <w:drawing>
+          <wp:inline distT="0" distB="0" distL="0" distR="0" wp14:anchorId="4741E634" wp14:editId="0BE111BB">
+            <wp:extent cx="4559300" cy="4083050"/>
+            <wp:effectExtent l="0" t="0" r="0" b="0"/>
+            <wp:docPr id="2" name="Imagen 2"/>
+            <wp:cNvGraphicFramePr>
+              <a:graphicFrameLocks xmlns:a="http://schemas.openxmlformats.org/drawingml/2006/main" noChangeAspect="1"/>
+            </wp:cNvGraphicFramePr>
+            <a:graphic xmlns:a="http://schemas.openxmlformats.org/drawingml/2006/main">
+              <a:graphicData uri="http://schemas.openxmlformats.org/drawingml/2006/picture">
+                <pic:pic xmlns:pic="http://schemas.openxmlformats.org/drawingml/2006/picture">
+                  <pic:nvPicPr>
+                    <pic:cNvPr id="0" name="Picture 1"/>
+                    <pic:cNvPicPr>
+                      <a:picLocks noChangeAspect="1" noChangeArrowheads="1"/>
+                    </pic:cNvPicPr>
+                  </pic:nvPicPr>
+                  <pic:blipFill>
+                    <a:blip r:embed="rId9">
+                      <a:extLst>
+                        <a:ext uri="{28A0092B-C50C-407E-A947-70E740481C1C}">
+                          <a14:useLocalDpi xmlns:a14="http://schemas.microsoft.com/office/drawing/2010/main" val="0"/>
+                        </a:ext>
+                      </a:extLst>
+                    </a:blip>
+                    <a:srcRect/>
+                    <a:stretch>
+                      <a:fillRect/>
+                    </a:stretch>
+                  </pic:blipFill>
+                  <pic:spPr bwMode="auto">
+                    <a:xfrm>
+                      <a:off x="0" y="0"/>
+                      <a:ext cx="4559300" cy="4083050"/>
+                    </a:xfrm>
+                    <a:prstGeom prst="rect">
+                      <a:avLst/>
+                    </a:prstGeom>
+                    <a:noFill/>
+                    <a:ln>
+                      <a:noFill/>
+                    </a:ln>
+                  </pic:spPr>
+                </pic:pic>
+              </a:graphicData>
+            </a:graphic>
+          </wp:inline>
+        </w:drawing>
+      </w:r>
+    </w:p>
+    <w:p>
+      <w:pPr>
+        <w:pStyle w:val="Ttulo1"/>
+        <w:spacing w:before="480" w:after="120"/>
+        <w:jc w:val="both"/>
+        <w:rPr>
+          <w:rFonts w:ascii="Times New Roman" w:hAnsi="Times New Roman" w:cs="Times New Roman"/>
+          <w:b/>
+          <w:bCs/>
+        </w:rPr>
+      </w:pPr>
+      <w:r>
+        <w:rPr>
+          <w:rFonts w:ascii="Times New Roman" w:hAnsi="Times New Roman" w:cs="Times New Roman"/>
+          <w:b/>
+          <w:bCs/>
+          <w:color w:val="000000"/>
+          <w:sz w:val="24"/>
+          <w:szCs w:val="24"/>
+        </w:rPr>
+        <w:t>6. Calidad y Robustez del Modelo</w:t>
+      </w:r>
+    </w:p>
+    <w:p>
+      <w:pPr>
+        <w:pStyle w:val="NormalWeb"/>
+        <w:spacing w:before="240" w:beforeAutospacing="0" w:after="240" w:afterAutospacing="0"/>
+        <w:jc w:val="both"/>
+      </w:pPr>
+      <w:r>
+        <w:rPr>
+          <w:color w:val="000000"/>
+        </w:rPr>
+        <w:t>El modelo fue sometido a diferentes pruebas estadísticas para validar su consistencia y robustez econométrica.</w:t>
+      </w:r>
+    </w:p>
+    <w:p>
+      <w:pPr>
+        <w:pStyle w:val="NormalWeb"/>
+        <w:spacing w:before="240" w:beforeAutospacing="0" w:after="240" w:afterAutospacing="0"/>
+        <w:jc w:val="both"/>
+      </w:pPr>
+      <w:r>
+        <w:rPr>
+          <w:noProof/>
+          <w:color w:val="000000"/>
+        </w:rPr>
+        <w:lastRenderedPageBreak/>
+        <w:drawing>
+          <wp:inline distT="0" distB="0" distL="0" distR="0" wp14:anchorId="46292624" wp14:editId="52C88705">
+            <wp:extent cx="4375150" cy="3752850"/>
+            <wp:effectExtent l="0" t="0" r="6350" b="0"/>
+            <wp:docPr id="1" name="Imagen 1"/>
+            <wp:cNvGraphicFramePr>
+              <a:graphicFrameLocks xmlns:a="http://schemas.openxmlformats.org/drawingml/2006/main" noChangeAspect="1"/>
+            </wp:cNvGraphicFramePr>
+            <a:graphic xmlns:a="http://schemas.openxmlformats.org/drawingml/2006/main">
+              <a:graphicData uri="http://schemas.openxmlformats.org/drawingml/2006/picture">
+                <pic:pic xmlns:pic="http://schemas.openxmlformats.org/drawingml/2006/picture">
+                  <pic:nvPicPr>
+                    <pic:cNvPr id="0" name="Picture 2"/>
+                    <pic:cNvPicPr>
+                      <a:picLocks noChangeAspect="1" noChangeArrowheads="1"/>
+                    </pic:cNvPicPr>
+                  </pic:nvPicPr>
+                  <pic:blipFill>
+                    <a:blip r:embed="rId10">
+                      <a:extLst>
+                        <a:ext uri="{28A0092B-C50C-407E-A947-70E740481C1C}">
+                          <a14:useLocalDpi xmlns:a14="http://schemas.microsoft.com/office/drawing/2010/main" val="0"/>
+                        </a:ext>
+                      </a:extLst>
+                    </a:blip>
+                    <a:srcRect/>
+                    <a:stretch>
+                      <a:fillRect/>
+                    </a:stretch>
+                  </pic:blipFill>
+                  <pic:spPr bwMode="auto">
+                    <a:xfrm>
+                      <a:off x="0" y="0"/>
+                      <a:ext cx="4375150" cy="3752850"/>
+                    </a:xfrm>
+                    <a:prstGeom prst="rect">
+                      <a:avLst/>
+                    </a:prstGeom>
+                    <a:noFill/>
+                    <a:ln>
+                      <a:noFill/>
+                    </a:ln>
+                  </pic:spPr>
+                </pic:pic>
+              </a:graphicData>
+            </a:graphic>
+          </wp:inline>
+        </w:drawing>
+      </w:r>
+    </w:p>
+    <w:p>
+      <w:pPr>
+        <w:pStyle w:val="NormalWeb"/>
+        <w:spacing w:before="240" w:beforeAutospacing="0" w:after="240" w:afterAutospacing="0"/>
+        <w:jc w:val="both"/>
+      </w:pPr>
+      <w:r>
+        <w:rPr>
+          <w:i/>
+          <w:iCs/>
+          <w:color w:val="000000"/>
+        </w:rPr>
+        <w:t>Gráfica 2. Matriz de correlación entre variables numéricas</w:t>
+      </w:r>
+    </w:p>
+    <w:p>
+      <w:pPr>
+        <w:pStyle w:val="NormalWeb"/>
+        <w:spacing w:before="240" w:beforeAutospacing="0" w:after="240" w:afterAutospacing="0"/>
+        <w:jc w:val="both"/>
+      </w:pPr>
+      <w:r>
+        <w:rPr>
+          <w:color w:val="000000"/>
+        </w:rPr>
+        <w:t xml:space="preserve">El análisis de correlaciones a nivel SKU-día reveló una correlación de </w:t>
+      </w:r>
+      <w:r>
+        <w:rPr>
+          <w:b/>
+          <w:bCs/>
+          <w:color w:val="000000"/>
+        </w:rPr>
+        <w:t>r = -0.667</w:t>
+      </w:r>
+      <w:r>
+        <w:rPr>
+          <w:color w:val="000000"/>
+        </w:rPr>
+        <w:t xml:space="preserve"> entre el índice de precio y las ventas, confirmando una relación negativa fuerte y estadísticamente significativa donde los precios más altos tienden a asociarse con menores niveles de ventas. La variación de precio respecto al promedio del SKU mostró una correlación positiva con las ventas de </w:t>
+      </w:r>
+      <w:r>
+        <w:rPr>
+          <w:b/>
+          <w:bCs/>
+          <w:color w:val="000000"/>
+        </w:rPr>
+        <w:t>r = +0.578</w:t>
+      </w:r>
+      <w:r>
+        <w:rPr>
+          <w:color w:val="000000"/>
+        </w:rPr>
+        <w:t xml:space="preserve">, lo </w:t>
+      </w:r>
+      <w:proofErr w:type="gramStart"/>
+      <w:r>
+        <w:rPr>
+          <w:color w:val="000000"/>
+        </w:rPr>
+        <w:t>que</w:t>
+      </w:r>
+      <w:proofErr w:type="gramEnd"/>
+      <w:r>
+        <w:rPr>
+          <w:color w:val="000000"/>
+        </w:rPr>
+        <w:t xml:space="preserve"> valida el proxy de descuento implícito construido, es decir, cuando el precio cae por debajo del promedio histórico del producto, las ventas aumentan, indicando que reducciones relativas en el precio favorecen incrementos en la demanda.</w:t>
+      </w:r>
+    </w:p>
+    <w:p>
+      <w:pPr>
+        <w:pStyle w:val="NormalWeb"/>
+        <w:spacing w:before="240" w:beforeAutospacing="0" w:after="240" w:afterAutospacing="0"/>
+        <w:jc w:val="both"/>
+      </w:pPr>
+      <w:r>
+        <w:rPr>
+          <w:color w:val="000000"/>
+        </w:rPr>
+        <w:t>Por otro lado, el costo no presenta correlación significativa con las ventas (</w:t>
+      </w:r>
+      <w:r>
+        <w:rPr>
+          <w:b/>
+          <w:bCs/>
+          <w:color w:val="000000"/>
+        </w:rPr>
+        <w:t>r ≈ 0</w:t>
+      </w:r>
+      <w:r>
+        <w:rPr>
+          <w:color w:val="000000"/>
+        </w:rPr>
+        <w:t>), lo que es consistente con la teoría de que el consumidor no observa el costo interno, solo el precio final. En conjunto, estas correlaciones respaldan la hipótesis principal del proyecto: el precio constituye uno de los factores más relevantes para explicar el comportamiento de las ventas en el sector moda.</w:t>
+      </w:r>
+    </w:p>
+    <w:p>
+      <w:pPr>
+        <w:spacing w:after="240"/>
+        <w:jc w:val="both"/>
+      </w:pPr>
+    </w:p>
+    <w:p>
+      <w:pPr>
+        <w:pStyle w:val="Ttulo2"/>
+        <w:spacing w:before="360"/>
+        <w:jc w:val="both"/>
+        <w:rPr>
+          <w:rFonts w:ascii="Times New Roman" w:hAnsi="Times New Roman" w:cs="Times New Roman"/>
+          <w:b/>
+          <w:bCs/>
+        </w:rPr>
+      </w:pPr>
+      <w:r>
+        <w:rPr>
+          <w:rFonts w:ascii="Times New Roman" w:hAnsi="Times New Roman" w:cs="Times New Roman"/>
+          <w:b/>
+          <w:bCs/>
+          <w:color w:val="000000"/>
+          <w:sz w:val="24"/>
+          <w:szCs w:val="24"/>
+        </w:rPr>
+        <w:t>6.1 Pruebas de Robustez </w:t>
+      </w:r>
+    </w:p>
+    <w:p>
+      <w:pPr>
+        <w:pStyle w:val="NormalWeb"/>
+        <w:spacing w:before="240" w:beforeAutospacing="0" w:after="240" w:afterAutospacing="0"/>
+        <w:jc w:val="both"/>
+      </w:pPr>
+      <w:r>
+        <w:rPr>
+          <w:color w:val="000000"/>
+        </w:rPr>
+        <w:t>Se realizaron diferentes pruebas econométricas para validar la consistencia estadística del modelo estimado.</w:t>
+      </w:r>
+    </w:p>
+    <w:p>
+      <w:pPr>
+        <w:pStyle w:val="NormalWeb"/>
+        <w:spacing w:before="240" w:beforeAutospacing="0" w:after="240" w:afterAutospacing="0"/>
+        <w:jc w:val="both"/>
+      </w:pPr>
+      <w:r>
+        <w:rPr>
+          <w:color w:val="000000"/>
+        </w:rPr>
+        <w:lastRenderedPageBreak/>
+        <w:t xml:space="preserve">El test de </w:t>
+      </w:r>
+      <w:proofErr w:type="spellStart"/>
+      <w:r>
+        <w:rPr>
+          <w:color w:val="000000"/>
+        </w:rPr>
+        <w:t>Breusch</w:t>
+      </w:r>
+      <w:proofErr w:type="spellEnd"/>
+      <w:r>
+        <w:rPr>
+          <w:color w:val="000000"/>
+        </w:rPr>
+        <w:t>-Pagan arrojó un estadístico de 1465.43 con p &lt; 0.001, evidenciando la presencia de heterocedasticidad. Debido a ello, se utilizaron errores estándar robustos HC3 para corregir posibles sesgos en la inferencia estadística.</w:t>
+      </w:r>
+    </w:p>
+    <w:p>
+      <w:pPr>
+        <w:pStyle w:val="NormalWeb"/>
+        <w:spacing w:before="240" w:beforeAutospacing="0" w:after="240" w:afterAutospacing="0"/>
+        <w:jc w:val="both"/>
+      </w:pPr>
+      <w:r>
+        <w:rPr>
+          <w:color w:val="000000"/>
+        </w:rPr>
+        <w:t>El test de Durbin-Watson produjo un valor de 1.5405. Aunque el valor ideal es cercano a 2, el resultado indica únicamente una leve autocorrelación positiva, sin comprometer de manera severa la validez del modelo.</w:t>
+      </w:r>
+    </w:p>
+    <w:p>
+      <w:pPr>
+        <w:pStyle w:val="NormalWeb"/>
+        <w:spacing w:before="240" w:beforeAutospacing="0" w:after="240" w:afterAutospacing="0"/>
+        <w:jc w:val="both"/>
+      </w:pPr>
+      <w:r>
+        <w:rPr>
+          <w:color w:val="000000"/>
+        </w:rPr>
+        <w:t>Asimismo, el test de Jarque-</w:t>
+      </w:r>
+      <w:proofErr w:type="spellStart"/>
+      <w:r>
+        <w:rPr>
+          <w:color w:val="000000"/>
+        </w:rPr>
+        <w:t>Bera</w:t>
+      </w:r>
+      <w:proofErr w:type="spellEnd"/>
+      <w:r>
+        <w:rPr>
+          <w:color w:val="000000"/>
+        </w:rPr>
+        <w:t xml:space="preserve"> obtuvo un estadístico de 523.15 con p &lt; 0.001, indicando que los residuos no siguen una distribución normal. Sin embargo, dado el tamaño elevado de la muestra (n ≈ 11,200), el Teorema Central del Límite permite mantener la validez de las estimaciones e inferencias.</w:t>
+      </w:r>
+    </w:p>
+    <w:p>
+      <w:pPr>
+        <w:pStyle w:val="NormalWeb"/>
+        <w:spacing w:before="240" w:beforeAutospacing="0" w:after="240" w:afterAutospacing="0"/>
+        <w:jc w:val="both"/>
+        <w:rPr>
+          <w:color w:val="000000"/>
+        </w:rPr>
+      </w:pPr>
+      <w:r>
+        <w:rPr>
+          <w:color w:val="000000"/>
+        </w:rPr>
+        <w:t>Finalmente, el análisis de VIF no evidenció problemas severos de multicolinealidad, ya que los factores de inflación de varianza se mantuvieron por debajo de los niveles críticos.</w:t>
+      </w:r>
+    </w:p>
+    <w:p>
+      <w:pPr>
+        <w:pStyle w:val="Ttulo1"/>
+        <w:spacing w:before="480" w:after="120"/>
+        <w:jc w:val="both"/>
+        <w:rPr>
+          <w:rFonts w:ascii="Times New Roman" w:hAnsi="Times New Roman" w:cs="Times New Roman"/>
+          <w:b/>
+          <w:bCs/>
+          <w:lang w:eastAsia="en-US"/>
+        </w:rPr>
+      </w:pPr>
+      <w:r>
+        <w:rPr>
+          <w:rFonts w:ascii="Times New Roman" w:hAnsi="Times New Roman" w:cs="Times New Roman"/>
+          <w:b/>
+          <w:bCs/>
+          <w:color w:val="000000"/>
+          <w:sz w:val="24"/>
+          <w:szCs w:val="24"/>
+        </w:rPr>
+        <w:t xml:space="preserve">7. </w:t>
+      </w:r>
+      <w:proofErr w:type="spellStart"/>
+      <w:r>
+        <w:rPr>
+          <w:rFonts w:ascii="Times New Roman" w:hAnsi="Times New Roman" w:cs="Times New Roman"/>
+          <w:b/>
+          <w:bCs/>
+          <w:color w:val="000000"/>
+          <w:sz w:val="24"/>
+          <w:szCs w:val="24"/>
+        </w:rPr>
+        <w:t>Forecasting</w:t>
+      </w:r>
+      <w:proofErr w:type="spellEnd"/>
+      <w:r>
+        <w:rPr>
+          <w:rFonts w:ascii="Times New Roman" w:hAnsi="Times New Roman" w:cs="Times New Roman"/>
+          <w:b/>
+          <w:bCs/>
+          <w:color w:val="000000"/>
+          <w:sz w:val="24"/>
+          <w:szCs w:val="24"/>
+        </w:rPr>
+        <w:t xml:space="preserve"> y Proyección de Ventas</w:t>
+      </w:r>
+    </w:p>
+    <w:p>
+      <w:pPr>
+        <w:pStyle w:val="NormalWeb"/>
+        <w:spacing w:before="0" w:beforeAutospacing="0" w:after="0" w:afterAutospacing="0"/>
+        <w:jc w:val="both"/>
+      </w:pPr>
+      <w:r>
+        <w:rPr>
+          <w:noProof/>
+          <w:color w:val="000000"/>
+        </w:rPr>
+        <w:drawing>
+          <wp:inline distT="0" distB="0" distL="0" distR="0" wp14:anchorId="5BE7848F" wp14:editId="63311270">
+            <wp:extent cx="5612130" cy="2806065"/>
+            <wp:effectExtent l="0" t="0" r="7620" b="0"/>
+            <wp:docPr id="3" name="Imagen 3"/>
+            <wp:cNvGraphicFramePr>
+              <a:graphicFrameLocks xmlns:a="http://schemas.openxmlformats.org/drawingml/2006/main" noChangeAspect="1"/>
+            </wp:cNvGraphicFramePr>
+            <a:graphic xmlns:a="http://schemas.openxmlformats.org/drawingml/2006/main">
+              <a:graphicData uri="http://schemas.openxmlformats.org/drawingml/2006/picture">
+                <pic:pic xmlns:pic="http://schemas.openxmlformats.org/drawingml/2006/picture">
+                  <pic:nvPicPr>
+                    <pic:cNvPr id="0" name="Picture 1"/>
+                    <pic:cNvPicPr>
+                      <a:picLocks noChangeAspect="1" noChangeArrowheads="1"/>
+                    </pic:cNvPicPr>
+                  </pic:nvPicPr>
+                  <pic:blipFill>
+                    <a:blip r:embed="rId11" cstate="print">
+                      <a:extLst>
+                        <a:ext uri="{28A0092B-C50C-407E-A947-70E740481C1C}">
+                          <a14:useLocalDpi xmlns:a14="http://schemas.microsoft.com/office/drawing/2010/main" val="0"/>
+                        </a:ext>
+                      </a:extLst>
+                    </a:blip>
+                    <a:srcRect/>
+                    <a:stretch>
+                      <a:fillRect/>
+                    </a:stretch>
+                  </pic:blipFill>
+                  <pic:spPr bwMode="auto">
+                    <a:xfrm>
+                      <a:off x="0" y="0"/>
+                      <a:ext cx="5612130" cy="2806065"/>
+                    </a:xfrm>
+                    <a:prstGeom prst="rect">
+                      <a:avLst/>
+                    </a:prstGeom>
+                    <a:noFill/>
+                    <a:ln>
+                      <a:noFill/>
+                    </a:ln>
+                  </pic:spPr>
+                </pic:pic>
+              </a:graphicData>
+            </a:graphic>
+          </wp:inline>
+        </w:drawing>
+      </w:r>
+    </w:p>
+    <w:p>
+      <w:pPr>
+        <w:pStyle w:val="NormalWeb"/>
+        <w:spacing w:before="0" w:beforeAutospacing="0" w:after="0" w:afterAutospacing="0"/>
+        <w:jc w:val="both"/>
+      </w:pPr>
+      <w:r>
+        <w:rPr>
+          <w:i/>
+          <w:iCs/>
+          <w:color w:val="000000"/>
+        </w:rPr>
+        <w:t xml:space="preserve">Gráfica 3. </w:t>
+      </w:r>
+      <w:proofErr w:type="spellStart"/>
+      <w:r>
+        <w:rPr>
+          <w:i/>
+          <w:iCs/>
+          <w:color w:val="000000"/>
+        </w:rPr>
+        <w:t>Forecasting</w:t>
+      </w:r>
+      <w:proofErr w:type="spellEnd"/>
+      <w:r>
+        <w:rPr>
+          <w:i/>
+          <w:iCs/>
+          <w:color w:val="000000"/>
+        </w:rPr>
+        <w:t xml:space="preserve"> de Ventas</w:t>
+      </w:r>
+    </w:p>
+    <w:p>
+      <w:pPr>
+        <w:pStyle w:val="NormalWeb"/>
+        <w:spacing w:before="240" w:beforeAutospacing="0" w:after="240" w:afterAutospacing="0"/>
+        <w:jc w:val="both"/>
+      </w:pPr>
+      <w:r>
+        <w:rPr>
+          <w:color w:val="000000"/>
+        </w:rPr>
+        <w:t xml:space="preserve">Además del modelo econométrico principal, se desarrolló un modelo de </w:t>
+      </w:r>
+      <w:proofErr w:type="spellStart"/>
+      <w:r>
+        <w:rPr>
+          <w:color w:val="000000"/>
+        </w:rPr>
+        <w:t>forecasting</w:t>
+      </w:r>
+      <w:proofErr w:type="spellEnd"/>
+      <w:r>
+        <w:rPr>
+          <w:color w:val="000000"/>
+        </w:rPr>
+        <w:t xml:space="preserve"> para proyectar ventas futuras utilizando tendencia temporal, patrones semanales y efectos por día de la semana. El modelo permitió generar proyecciones de ventas para un horizonte de seis meses, incorporando intervalos de confianza para medir incertidumbre </w:t>
+      </w:r>
+      <w:r>
+        <w:rPr>
+          <w:i/>
+          <w:iCs/>
+          <w:color w:val="000000"/>
+        </w:rPr>
+        <w:t>(Gráfica 3).</w:t>
+      </w:r>
+    </w:p>
+    <w:p>
+      <w:pPr>
+        <w:pStyle w:val="NormalWeb"/>
+        <w:spacing w:before="240" w:beforeAutospacing="0" w:after="240" w:afterAutospacing="0"/>
+        <w:jc w:val="both"/>
+      </w:pPr>
+      <w:r>
+        <w:rPr>
+          <w:color w:val="000000"/>
+        </w:rPr>
+        <w:t>Las proyecciones muestran que existen patrones estacionales claros en las ventas, donde algunos días presentan mayor volumen comercial y el comportamiento futuro mantiene una tendencia relativamente estable.</w:t>
+      </w:r>
+    </w:p>
+    <w:p>
+      <w:pPr>
+        <w:pStyle w:val="NormalWeb"/>
+        <w:spacing w:before="240" w:beforeAutospacing="0" w:after="240" w:afterAutospacing="0"/>
+        <w:jc w:val="both"/>
+        <w:rPr>
+          <w:color w:val="000000"/>
+        </w:rPr>
+      </w:pPr>
+      <w:r>
+        <w:rPr>
+          <w:color w:val="000000"/>
+        </w:rPr>
+        <w:t xml:space="preserve">El modelo de </w:t>
+      </w:r>
+      <w:proofErr w:type="spellStart"/>
+      <w:r>
+        <w:rPr>
+          <w:color w:val="000000"/>
+        </w:rPr>
+        <w:t>forecasting</w:t>
+      </w:r>
+      <w:proofErr w:type="spellEnd"/>
+      <w:r>
+        <w:rPr>
+          <w:color w:val="000000"/>
+        </w:rPr>
+        <w:t xml:space="preserve"> alcanzó un R² de 0.9910, evidenciando una elevada capacidad predictiva para capturar la dinámica temporal de las ventas. Asimismo, las estimaciones </w:t>
+      </w:r>
+      <w:r>
+        <w:rPr>
+          <w:color w:val="000000"/>
+        </w:rPr>
+        <w:lastRenderedPageBreak/>
+        <w:t>indican ventas promedio diarias cercanas a 5,395,950 unidades y ventas acumuladas aproximadas de 971,271,000 unidades para el horizonte proyectado de seis meses. </w:t>
+      </w:r>
+    </w:p>
+    <w:p>
+      <w:pPr>
+        <w:pStyle w:val="Ttulo1"/>
+        <w:spacing w:before="480" w:after="120"/>
+        <w:jc w:val="both"/>
+        <w:rPr>
+          <w:rFonts w:ascii="Times New Roman" w:hAnsi="Times New Roman" w:cs="Times New Roman"/>
+          <w:b/>
+          <w:bCs/>
+          <w:lang w:eastAsia="en-US"/>
+        </w:rPr>
+      </w:pPr>
+      <w:r>
+        <w:rPr>
+          <w:rFonts w:ascii="Times New Roman" w:hAnsi="Times New Roman" w:cs="Times New Roman"/>
+          <w:b/>
+          <w:bCs/>
+          <w:color w:val="000000"/>
+          <w:sz w:val="24"/>
+          <w:szCs w:val="24"/>
+          <w:shd w:val="clear" w:color="auto" w:fill="FFFFFF"/>
+        </w:rPr>
+        <w:t>8. Modelo alternativo y validez</w:t>
+      </w:r>
+    </w:p>
+    <w:p>
+      <w:pPr>
+        <w:pStyle w:val="NormalWeb"/>
+        <w:spacing w:before="240" w:beforeAutospacing="0" w:after="240" w:afterAutospacing="0"/>
+        <w:jc w:val="both"/>
+      </w:pPr>
+      <w:r>
+        <w:rPr>
+          <w:color w:val="000000"/>
+        </w:rPr>
+        <w:t xml:space="preserve">Como parte del análisis de robustez, se estimó un modelo alternativo reemplazando la variable continua de precio en logaritmos </w:t>
+      </w:r>
+      <w:r>
+        <w:rPr>
+          <w:i/>
+          <w:iCs/>
+          <w:color w:val="000000"/>
+        </w:rPr>
+        <w:t>(</w:t>
+      </w:r>
+      <w:proofErr w:type="spellStart"/>
+      <w:r>
+        <w:rPr>
+          <w:i/>
+          <w:iCs/>
+          <w:color w:val="000000"/>
+        </w:rPr>
+        <w:t>ln_precio</w:t>
+      </w:r>
+      <w:proofErr w:type="spellEnd"/>
+      <w:r>
+        <w:rPr>
+          <w:i/>
+          <w:iCs/>
+          <w:color w:val="000000"/>
+        </w:rPr>
+        <w:t>)</w:t>
+      </w:r>
+      <w:r>
+        <w:rPr>
+          <w:color w:val="000000"/>
+        </w:rPr>
+        <w:t xml:space="preserve"> por la variable categórica</w:t>
+      </w:r>
+      <w:r>
+        <w:rPr>
+          <w:i/>
+          <w:iCs/>
+          <w:color w:val="000000"/>
+        </w:rPr>
+        <w:t xml:space="preserve"> </w:t>
+      </w:r>
+      <w:proofErr w:type="spellStart"/>
+      <w:r>
+        <w:rPr>
+          <w:i/>
+          <w:iCs/>
+          <w:color w:val="000000"/>
+        </w:rPr>
+        <w:t>price_tier</w:t>
+      </w:r>
+      <w:proofErr w:type="spellEnd"/>
+      <w:r>
+        <w:rPr>
+          <w:color w:val="000000"/>
+        </w:rPr>
+        <w:t>, la cual clasifica los productos en diferentes niveles de precio. El objetivo de este ejercicio fue evaluar si una segmentación discreta de precios podía explicar el comportamiento de las ventas con una capacidad similar al modelo principal.</w:t>
+      </w:r>
+    </w:p>
+    <w:p>
+      <w:pPr>
+        <w:pStyle w:val="NormalWeb"/>
+        <w:spacing w:before="240" w:beforeAutospacing="0" w:after="240" w:afterAutospacing="0"/>
+        <w:jc w:val="both"/>
+      </w:pPr>
+      <w:r>
+        <w:rPr>
+          <w:color w:val="000000"/>
+        </w:rPr>
+        <w:t>El modelo alternativo obtuvo un coeficiente de determinación:</w:t>
+      </w:r>
+    </w:p>
+    <w:p>
+      <w:pPr>
+        <w:pStyle w:val="NormalWeb"/>
+        <w:spacing w:before="240" w:beforeAutospacing="0" w:after="240" w:afterAutospacing="0"/>
+        <w:jc w:val="both"/>
+      </w:pPr>
+      <w:r>
+        <w:rPr>
+          <w:color w:val="000000"/>
+        </w:rPr>
+        <w:t>R2=0.0066</w:t>
+      </w:r>
+    </w:p>
+    <w:p>
+      <w:pPr>
+        <w:pStyle w:val="NormalWeb"/>
+        <w:spacing w:before="240" w:beforeAutospacing="0" w:after="240" w:afterAutospacing="0"/>
+        <w:jc w:val="both"/>
+      </w:pPr>
+      <w:r>
+        <w:rPr>
+          <w:color w:val="000000"/>
+        </w:rPr>
+        <w:t>mientras que el modelo principal presentó:</w:t>
+      </w:r>
+    </w:p>
+    <w:p>
+      <w:pPr>
+        <w:pStyle w:val="NormalWeb"/>
+        <w:spacing w:before="240" w:beforeAutospacing="0" w:after="240" w:afterAutospacing="0"/>
+        <w:jc w:val="both"/>
+      </w:pPr>
+      <w:r>
+        <w:rPr>
+          <w:color w:val="000000"/>
+        </w:rPr>
+        <w:t>R2=0.5654</w:t>
+      </w:r>
+    </w:p>
+    <w:p>
+      <w:pPr>
+        <w:pStyle w:val="NormalWeb"/>
+        <w:spacing w:before="240" w:beforeAutospacing="0" w:after="240" w:afterAutospacing="0"/>
+        <w:jc w:val="both"/>
+      </w:pPr>
+      <w:r>
+        <w:rPr>
+          <w:color w:val="000000"/>
+        </w:rPr>
+        <w:t>La diferencia entre ambos resultados es sustancial. Un R2de 0.0066 implica que el modelo alternativo únicamente logra explicar aproximadamente el 0.66% de la variación observada en las ventas, lo cual evidencia una capacidad explicativa extremadamente baja. En contraste, el modelo principal explica más del 56% de la variabilidad de la demanda, mostrando un desempeño considerablemente superior.</w:t>
+      </w:r>
+    </w:p>
+    <w:p>
+      <w:pPr>
+        <w:pStyle w:val="NormalWeb"/>
+        <w:spacing w:before="240" w:beforeAutospacing="0" w:after="240" w:afterAutospacing="0"/>
+        <w:jc w:val="both"/>
+      </w:pPr>
+      <w:r>
+        <w:rPr>
+          <w:color w:val="000000"/>
+        </w:rPr>
+        <w:t>Estos resultados indican que el precio como variable continua contiene información mucho más precisa y relevante para capturar el comportamiento de los consumidores que una clasificación general por rangos de precios. Al transformar el precio en categorías (</w:t>
+      </w:r>
+      <w:proofErr w:type="spellStart"/>
+      <w:r>
+        <w:rPr>
+          <w:i/>
+          <w:iCs/>
+          <w:color w:val="000000"/>
+        </w:rPr>
+        <w:t>price_tier</w:t>
+      </w:r>
+      <w:proofErr w:type="spellEnd"/>
+      <w:r>
+        <w:rPr>
+          <w:color w:val="000000"/>
+        </w:rPr>
+        <w:t>), se pierde variabilidad e información económica importante, reduciendo significativamente la capacidad predictiva del modelo.</w:t>
+      </w:r>
+    </w:p>
+    <w:p>
+      <w:pPr>
+        <w:pStyle w:val="NormalWeb"/>
+        <w:spacing w:before="240" w:beforeAutospacing="0" w:after="240" w:afterAutospacing="0"/>
+        <w:jc w:val="both"/>
+      </w:pPr>
+      <w:r>
+        <w:rPr>
+          <w:color w:val="000000"/>
+        </w:rPr>
+        <w:t xml:space="preserve">Desde una perspectiva econométrica y estratégica, esto valida la elección de una especificación logarítmica basada en elasticidades. El modelo principal no solo presenta mayor poder explicativo, sino que también permite interpretar directamente la sensibilidad de la demanda ante cambios porcentuales en el precio, lo cual resulta fundamental para la toma de decisiones comerciales y de </w:t>
+      </w:r>
+      <w:proofErr w:type="spellStart"/>
+      <w:r>
+        <w:rPr>
+          <w:color w:val="000000"/>
+        </w:rPr>
+        <w:t>pricing</w:t>
+      </w:r>
+      <w:proofErr w:type="spellEnd"/>
+      <w:r>
+        <w:rPr>
+          <w:color w:val="000000"/>
+        </w:rPr>
+        <w:t xml:space="preserve"> en el sector moda.</w:t>
+      </w:r>
+    </w:p>
+    <w:p>
+      <w:pPr>
+        <w:pStyle w:val="NormalWeb"/>
+        <w:spacing w:before="240" w:beforeAutospacing="0" w:after="240" w:afterAutospacing="0"/>
+        <w:jc w:val="both"/>
+        <w:rPr>
+          <w:color w:val="000000"/>
+        </w:rPr>
+      </w:pPr>
+      <w:r>
+        <w:rPr>
+          <w:color w:val="000000"/>
+        </w:rPr>
+        <w:t>En consecuencia, el modelo log-log utilizado en el análisis principal puede considerarse el enfoque más adecuado para estudiar la relación entre precios y ventas, tanto por su consistencia teórica como por su superior desempeño estadístico.</w:t>
+      </w:r>
+    </w:p>
+    <w:p>
+      <w:pPr>
+        <w:pStyle w:val="Ttulo1"/>
+        <w:spacing w:before="480" w:after="120"/>
+        <w:jc w:val="both"/>
+        <w:rPr>
+          <w:rFonts w:ascii="Times New Roman" w:hAnsi="Times New Roman" w:cs="Times New Roman"/>
+          <w:b/>
+          <w:bCs/>
+          <w:lang w:eastAsia="en-US"/>
+        </w:rPr>
+      </w:pPr>
+      <w:r>
+        <w:rPr>
+          <w:rFonts w:ascii="Times New Roman" w:hAnsi="Times New Roman" w:cs="Times New Roman"/>
+          <w:b/>
+          <w:bCs/>
+          <w:color w:val="000000"/>
+          <w:sz w:val="24"/>
+          <w:szCs w:val="24"/>
+          <w:shd w:val="clear" w:color="auto" w:fill="FFFFFF"/>
+        </w:rPr>
+        <w:lastRenderedPageBreak/>
+        <w:t xml:space="preserve">9. </w:t>
+      </w:r>
+      <w:proofErr w:type="spellStart"/>
+      <w:r>
+        <w:rPr>
+          <w:rFonts w:ascii="Times New Roman" w:hAnsi="Times New Roman" w:cs="Times New Roman"/>
+          <w:b/>
+          <w:bCs/>
+          <w:color w:val="000000"/>
+          <w:sz w:val="24"/>
+          <w:szCs w:val="24"/>
+          <w:shd w:val="clear" w:color="auto" w:fill="FFFFFF"/>
+        </w:rPr>
+        <w:t>Dashboard</w:t>
+      </w:r>
+      <w:proofErr w:type="spellEnd"/>
+      <w:r>
+        <w:rPr>
+          <w:rFonts w:ascii="Times New Roman" w:hAnsi="Times New Roman" w:cs="Times New Roman"/>
+          <w:b/>
+          <w:bCs/>
+          <w:color w:val="000000"/>
+          <w:sz w:val="24"/>
+          <w:szCs w:val="24"/>
+          <w:shd w:val="clear" w:color="auto" w:fill="FFFFFF"/>
+        </w:rPr>
+        <w:t xml:space="preserve"> Interactivo</w:t>
+      </w:r>
+    </w:p>
+    <w:p>
+      <w:pPr>
+        <w:pStyle w:val="NormalWeb"/>
+        <w:spacing w:before="240" w:beforeAutospacing="0" w:after="240" w:afterAutospacing="0"/>
+        <w:jc w:val="both"/>
+      </w:pPr>
+      <w:r>
+        <w:rPr>
+          <w:noProof/>
+        </w:rPr>
+        <w:drawing>
+          <wp:inline distT="0" distB="0" distL="0" distR="0" wp14:anchorId="1944D373" wp14:editId="74F1EBCB">
+            <wp:extent cx="5612130" cy="2771775"/>
+            <wp:effectExtent l="0" t="0" r="7620" b="9525"/>
+            <wp:docPr id="4" name="Imagen 4"/>
+            <wp:cNvGraphicFramePr>
+              <a:graphicFrameLocks xmlns:a="http://schemas.openxmlformats.org/drawingml/2006/main" noChangeAspect="1"/>
+            </wp:cNvGraphicFramePr>
+            <a:graphic xmlns:a="http://schemas.openxmlformats.org/drawingml/2006/main">
+              <a:graphicData uri="http://schemas.openxmlformats.org/drawingml/2006/picture">
+                <pic:pic xmlns:pic="http://schemas.openxmlformats.org/drawingml/2006/picture">
+                  <pic:nvPicPr>
+                    <pic:cNvPr id="0" name="Picture 1"/>
+                    <pic:cNvPicPr>
+                      <a:picLocks noChangeAspect="1" noChangeArrowheads="1"/>
+                    </pic:cNvPicPr>
+                  </pic:nvPicPr>
+                  <pic:blipFill>
+                    <a:blip r:embed="rId12" cstate="print">
+                      <a:extLst>
+                        <a:ext uri="{28A0092B-C50C-407E-A947-70E740481C1C}">
+                          <a14:useLocalDpi xmlns:a14="http://schemas.microsoft.com/office/drawing/2010/main" val="0"/>
+                        </a:ext>
+                      </a:extLst>
+                    </a:blip>
+                    <a:srcRect/>
+                    <a:stretch>
+                      <a:fillRect/>
+                    </a:stretch>
+                  </pic:blipFill>
+                  <pic:spPr bwMode="auto">
+                    <a:xfrm>
+                      <a:off x="0" y="0"/>
+                      <a:ext cx="5612130" cy="2771775"/>
+                    </a:xfrm>
+                    <a:prstGeom prst="rect">
+                      <a:avLst/>
+                    </a:prstGeom>
+                    <a:noFill/>
+                    <a:ln>
+                      <a:noFill/>
+                    </a:ln>
+                  </pic:spPr>
+                </pic:pic>
+              </a:graphicData>
+            </a:graphic>
+          </wp:inline>
+        </w:drawing>
+      </w:r>
+    </w:p>
+    <w:p>
+      <w:pPr>
+        <w:pStyle w:val="NormalWeb"/>
+        <w:spacing w:before="240" w:beforeAutospacing="0" w:after="240" w:afterAutospacing="0"/>
+        <w:jc w:val="both"/>
+      </w:pPr>
+      <w:hyperlink r:id="rId13" w:history="1">
+        <w:r>
+          <w:rPr>
+            <w:rStyle w:val="Hipervnculo"/>
+            <w:rFonts w:eastAsiaTheme="majorEastAsia"/>
+            <w:i/>
+            <w:iCs/>
+            <w:color w:val="1155CC"/>
+          </w:rPr>
+          <w:t xml:space="preserve">Imagen de referencia del </w:t>
+        </w:r>
+        <w:proofErr w:type="spellStart"/>
+        <w:r>
+          <w:rPr>
+            <w:rStyle w:val="Hipervnculo"/>
+            <w:rFonts w:eastAsiaTheme="majorEastAsia"/>
+            <w:i/>
+            <w:iCs/>
+            <w:color w:val="1155CC"/>
+          </w:rPr>
+          <w:t>Dashboard</w:t>
+        </w:r>
+        <w:proofErr w:type="spellEnd"/>
+        <w:r>
+          <w:rPr>
+            <w:rStyle w:val="Hipervnculo"/>
+            <w:rFonts w:eastAsiaTheme="majorEastAsia"/>
+            <w:i/>
+            <w:iCs/>
+            <w:color w:val="1155CC"/>
+          </w:rPr>
+          <w:t xml:space="preserve"> interactivo</w:t>
+        </w:r>
+      </w:hyperlink>
+    </w:p>
+    <w:p>
+      <w:pPr>
+        <w:pStyle w:val="NormalWeb"/>
+        <w:spacing w:before="240" w:beforeAutospacing="0" w:after="240" w:afterAutospacing="0"/>
+        <w:jc w:val="both"/>
+      </w:pPr>
+      <w:r>
+        <w:rPr>
+          <w:color w:val="000000"/>
+        </w:rPr>
+        <w:t xml:space="preserve">Se desarrolló un </w:t>
+      </w:r>
+      <w:proofErr w:type="spellStart"/>
+      <w:r>
+        <w:rPr>
+          <w:color w:val="000000"/>
+        </w:rPr>
+        <w:t>dashboard</w:t>
+      </w:r>
+      <w:proofErr w:type="spellEnd"/>
+      <w:r>
+        <w:rPr>
+          <w:color w:val="000000"/>
+        </w:rPr>
+        <w:t xml:space="preserve"> interactivo utilizando </w:t>
+      </w:r>
+      <w:proofErr w:type="spellStart"/>
+      <w:r>
+        <w:rPr>
+          <w:color w:val="000000"/>
+        </w:rPr>
+        <w:t>Shiny</w:t>
+      </w:r>
+      <w:proofErr w:type="spellEnd"/>
+      <w:r>
+        <w:rPr>
+          <w:color w:val="000000"/>
+        </w:rPr>
+        <w:t xml:space="preserve"> y </w:t>
+      </w:r>
+      <w:proofErr w:type="spellStart"/>
+      <w:r>
+        <w:rPr>
+          <w:color w:val="000000"/>
+        </w:rPr>
+        <w:t>Plotly</w:t>
+      </w:r>
+      <w:proofErr w:type="spellEnd"/>
+      <w:r>
+        <w:rPr>
+          <w:color w:val="000000"/>
+        </w:rPr>
+        <w:t xml:space="preserve"> con cinco módulos principales:</w:t>
+      </w:r>
+    </w:p>
+    <w:p>
+      <w:pPr>
+        <w:pStyle w:val="NormalWeb"/>
+        <w:numPr>
+          <w:ilvl w:val="0"/>
+          <w:numId w:val="8"/>
+        </w:numPr>
+        <w:spacing w:before="240" w:beforeAutospacing="0" w:after="0" w:afterAutospacing="0"/>
+        <w:textAlignment w:val="baseline"/>
+        <w:rPr>
+          <w:color w:val="000000"/>
+        </w:rPr>
+      </w:pPr>
+      <w:proofErr w:type="spellStart"/>
+      <w:r>
+        <w:rPr>
+          <w:color w:val="000000"/>
+        </w:rPr>
+        <w:t>Forecasting</w:t>
+      </w:r>
+      <w:proofErr w:type="spellEnd"/>
+      <w:r>
+        <w:rPr>
+          <w:color w:val="000000"/>
+        </w:rPr>
+        <w:t xml:space="preserve"> de ventas.</w:t>
+      </w:r>
+    </w:p>
+    <w:p>
+      <w:pPr>
+        <w:pStyle w:val="NormalWeb"/>
+        <w:numPr>
+          <w:ilvl w:val="0"/>
+          <w:numId w:val="8"/>
+        </w:numPr>
+        <w:spacing w:before="0" w:beforeAutospacing="0" w:after="0" w:afterAutospacing="0"/>
+        <w:textAlignment w:val="baseline"/>
+        <w:rPr>
+          <w:color w:val="000000"/>
+        </w:rPr>
+      </w:pPr>
+      <w:r>
+        <w:rPr>
+          <w:color w:val="000000"/>
+        </w:rPr>
+        <w:t>Resultados del modelo econométrico.</w:t>
+      </w:r>
+    </w:p>
+    <w:p>
+      <w:pPr>
+        <w:pStyle w:val="NormalWeb"/>
+        <w:numPr>
+          <w:ilvl w:val="0"/>
+          <w:numId w:val="8"/>
+        </w:numPr>
+        <w:spacing w:before="0" w:beforeAutospacing="0" w:after="0" w:afterAutospacing="0"/>
+        <w:textAlignment w:val="baseline"/>
+        <w:rPr>
+          <w:color w:val="000000"/>
+        </w:rPr>
+      </w:pPr>
+      <w:r>
+        <w:rPr>
+          <w:color w:val="000000"/>
+        </w:rPr>
+        <w:t>Correlaciones entre variables.</w:t>
+      </w:r>
+    </w:p>
+    <w:p>
+      <w:pPr>
+        <w:pStyle w:val="NormalWeb"/>
+        <w:numPr>
+          <w:ilvl w:val="0"/>
+          <w:numId w:val="8"/>
+        </w:numPr>
+        <w:spacing w:before="0" w:beforeAutospacing="0" w:after="0" w:afterAutospacing="0"/>
+        <w:textAlignment w:val="baseline"/>
+        <w:rPr>
+          <w:color w:val="000000"/>
+        </w:rPr>
+      </w:pPr>
+      <w:r>
+        <w:rPr>
+          <w:color w:val="000000"/>
+        </w:rPr>
+        <w:t>Pruebas de robustez.</w:t>
+      </w:r>
+    </w:p>
+    <w:p>
+      <w:pPr>
+        <w:pStyle w:val="NormalWeb"/>
+        <w:numPr>
+          <w:ilvl w:val="0"/>
+          <w:numId w:val="8"/>
+        </w:numPr>
+        <w:spacing w:before="0" w:beforeAutospacing="0" w:after="240" w:afterAutospacing="0"/>
+        <w:textAlignment w:val="baseline"/>
+        <w:rPr>
+          <w:color w:val="000000"/>
+        </w:rPr>
+      </w:pPr>
+      <w:r>
+        <w:rPr>
+          <w:color w:val="000000"/>
+        </w:rPr>
+        <w:t>Predictor interactivo y curva de demanda.</w:t>
+      </w:r>
+    </w:p>
+    <w:p>
+      <w:pPr>
+        <w:pStyle w:val="NormalWeb"/>
+        <w:spacing w:before="240" w:beforeAutospacing="0" w:after="240" w:afterAutospacing="0"/>
+        <w:jc w:val="both"/>
+        <w:rPr>
+          <w:color w:val="000000"/>
+        </w:rPr>
+      </w:pPr>
+      <w:r>
+        <w:rPr>
+          <w:color w:val="000000"/>
+        </w:rPr>
+        <w:t xml:space="preserve">El </w:t>
+      </w:r>
+      <w:proofErr w:type="spellStart"/>
+      <w:r>
+        <w:rPr>
+          <w:color w:val="000000"/>
+        </w:rPr>
+        <w:t>dashboard</w:t>
+      </w:r>
+      <w:proofErr w:type="spellEnd"/>
+      <w:r>
+        <w:rPr>
+          <w:color w:val="000000"/>
+        </w:rPr>
+        <w:t xml:space="preserve"> permite visualizar métricas clave, explorar relaciones entre variables y simular escenarios de precios para apoyar decisiones estratégicas de </w:t>
+      </w:r>
+      <w:proofErr w:type="spellStart"/>
+      <w:r>
+        <w:rPr>
+          <w:color w:val="000000"/>
+        </w:rPr>
+        <w:t>pricing</w:t>
+      </w:r>
+      <w:proofErr w:type="spellEnd"/>
+      <w:r>
+        <w:rPr>
+          <w:color w:val="000000"/>
+        </w:rPr>
+        <w:t>.</w:t>
+      </w:r>
+    </w:p>
+    <w:p>
+      <w:pPr>
+        <w:pStyle w:val="Ttulo2"/>
+        <w:spacing w:before="360"/>
+        <w:jc w:val="both"/>
+        <w:rPr>
+          <w:rFonts w:ascii="Times New Roman" w:hAnsi="Times New Roman" w:cs="Times New Roman"/>
+          <w:b/>
+          <w:bCs/>
+          <w:lang w:eastAsia="en-US"/>
+        </w:rPr>
+      </w:pPr>
+      <w:r>
+        <w:rPr>
+          <w:rFonts w:ascii="Times New Roman" w:hAnsi="Times New Roman" w:cs="Times New Roman"/>
+          <w:b/>
+          <w:bCs/>
+          <w:color w:val="000000"/>
+          <w:sz w:val="24"/>
+          <w:szCs w:val="24"/>
+        </w:rPr>
+        <w:t>10. Conclusiones Generales</w:t>
+      </w:r>
+    </w:p>
+    <w:p>
+      <w:pPr>
+        <w:pStyle w:val="NormalWeb"/>
+        <w:spacing w:before="240" w:beforeAutospacing="0" w:after="240" w:afterAutospacing="0"/>
+        <w:jc w:val="both"/>
+      </w:pPr>
+      <w:r>
+        <w:rPr>
+          <w:color w:val="000000"/>
+        </w:rPr>
+        <w:t xml:space="preserve">Los resultados obtenidos a lo largo del análisis econométrico permiten concluir que el precio constituye el principal determinante del comportamiento de la demanda dentro del sector moda. La estimación de una elasticidad precio de: </w:t>
+      </w:r>
+      <w:proofErr w:type="spellStart"/>
+      <w:r>
+        <w:rPr>
+          <w:color w:val="000000"/>
+        </w:rPr>
+        <w:t>εp</w:t>
+      </w:r>
+      <w:proofErr w:type="spellEnd"/>
+      <w:r>
+        <w:rPr>
+          <w:color w:val="000000"/>
+        </w:rPr>
+        <w:t>=−3.303</w:t>
+      </w:r>
+    </w:p>
+    <w:p>
+      <w:pPr>
+        <w:pStyle w:val="NormalWeb"/>
+        <w:spacing w:before="240" w:beforeAutospacing="0" w:after="240" w:afterAutospacing="0"/>
+        <w:jc w:val="both"/>
+      </w:pPr>
+      <w:r>
+        <w:rPr>
+          <w:color w:val="000000"/>
+        </w:rPr>
+        <w:t xml:space="preserve">Lo cual evidencia una elevada sensibilidad de los consumidores frente a cambios en los precios de los productos. En términos económicos, esto implica que pequeñas variaciones en la estrategia de </w:t>
+      </w:r>
+      <w:proofErr w:type="spellStart"/>
+      <w:r>
+        <w:rPr>
+          <w:color w:val="000000"/>
+        </w:rPr>
+        <w:t>pricing</w:t>
+      </w:r>
+      <w:proofErr w:type="spellEnd"/>
+      <w:r>
+        <w:rPr>
+          <w:color w:val="000000"/>
+        </w:rPr>
+        <w:t xml:space="preserve"> pueden generar efectos significativos sobre el volumen de ventas, convirtiendo al precio en una variable crítica para la toma de decisiones comerciales.</w:t>
+      </w:r>
+    </w:p>
+    <w:p>
+      <w:pPr>
+        <w:pStyle w:val="NormalWeb"/>
+        <w:spacing w:before="240" w:beforeAutospacing="0" w:after="240" w:afterAutospacing="0"/>
+        <w:jc w:val="both"/>
+      </w:pPr>
+      <w:r>
+        <w:rPr>
+          <w:color w:val="000000"/>
+        </w:rPr>
+        <w:t xml:space="preserve">Adicionalmente, el análisis demostró la existencia de diferencias importantes entre categorías y marcas. Categorías como </w:t>
+      </w:r>
+      <w:proofErr w:type="spellStart"/>
+      <w:r>
+        <w:rPr>
+          <w:i/>
+          <w:iCs/>
+          <w:color w:val="000000"/>
+        </w:rPr>
+        <w:t>Shoes</w:t>
+      </w:r>
+      <w:proofErr w:type="spellEnd"/>
+      <w:r>
+        <w:rPr>
+          <w:color w:val="000000"/>
+        </w:rPr>
+        <w:t xml:space="preserve"> y </w:t>
+      </w:r>
+      <w:proofErr w:type="spellStart"/>
+      <w:r>
+        <w:rPr>
+          <w:i/>
+          <w:iCs/>
+          <w:color w:val="000000"/>
+        </w:rPr>
+        <w:t>Trainers</w:t>
+      </w:r>
+      <w:proofErr w:type="spellEnd"/>
+      <w:r>
+        <w:rPr>
+          <w:color w:val="000000"/>
+        </w:rPr>
+        <w:t xml:space="preserve"> presentaron efectos positivos y significativos sobre las ventas, indicando una mayor capacidad de atracción de demanda incluso </w:t>
+      </w:r>
+      <w:r>
+        <w:rPr>
+          <w:color w:val="000000"/>
+        </w:rPr>
+        <w:lastRenderedPageBreak/>
+        <w:t xml:space="preserve">controlando por precio y costos. Por el contrario, categorías como </w:t>
+      </w:r>
+      <w:r>
+        <w:rPr>
+          <w:i/>
+          <w:iCs/>
+          <w:color w:val="000000"/>
+        </w:rPr>
+        <w:t>Top</w:t>
+      </w:r>
+      <w:r>
+        <w:rPr>
+          <w:color w:val="000000"/>
+        </w:rPr>
+        <w:t xml:space="preserve"> mostraron efectos negativos, reflejando una menor respuesta del consumidor o una posible saturación competitiva dentro de ese segmento. Asimismo, algunas marcas evidenciaron desempeños heterogéneos, destacándose el caso de </w:t>
+      </w:r>
+      <w:r>
+        <w:rPr>
+          <w:i/>
+          <w:iCs/>
+          <w:color w:val="000000"/>
+        </w:rPr>
+        <w:t>Brand_4</w:t>
+      </w:r>
+      <w:r>
+        <w:rPr>
+          <w:color w:val="000000"/>
+        </w:rPr>
+        <w:t>, cuyo efecto negativo sugiere posibles debilidades en posicionamiento, diferenciación o percepción de valor por parte de los consumidores.</w:t>
+      </w:r>
+    </w:p>
+    <w:p>
+      <w:pPr>
+        <w:pStyle w:val="NormalWeb"/>
+        <w:spacing w:before="240" w:beforeAutospacing="0" w:after="240" w:afterAutospacing="0"/>
+        <w:jc w:val="both"/>
+      </w:pPr>
+      <w:r>
+        <w:rPr>
+          <w:color w:val="000000"/>
+        </w:rPr>
+        <w:t>Desde el punto de vista metodológico, las pruebas de robustez realizadas permitieron validar la consistencia estadística del modelo principal. La utilización de errores robustos HC3, junto con pruebas de heterocedasticidad, normalidad y autocorrelación, confirmó que la relación estimada entre precios y ventas mantiene estabilidad econométrica. Además, el modelo alternativo basado en</w:t>
+      </w:r>
+      <w:r>
+        <w:rPr>
+          <w:i/>
+          <w:iCs/>
+          <w:color w:val="000000"/>
+        </w:rPr>
+        <w:t xml:space="preserve"> </w:t>
+      </w:r>
+      <w:proofErr w:type="spellStart"/>
+      <w:r>
+        <w:rPr>
+          <w:i/>
+          <w:iCs/>
+          <w:color w:val="000000"/>
+        </w:rPr>
+        <w:t>price_tier</w:t>
+      </w:r>
+      <w:proofErr w:type="spellEnd"/>
+      <w:r>
+        <w:rPr>
+          <w:color w:val="000000"/>
+        </w:rPr>
+        <w:t xml:space="preserve"> mostró una capacidad explicativa significativamente inferior, reforzando la superioridad del modelo logarítmico de elasticidades para representar el comportamiento de la demanda.</w:t>
+      </w:r>
+    </w:p>
+    <w:p>
+      <w:pPr>
+        <w:pStyle w:val="NormalWeb"/>
+        <w:spacing w:before="240" w:beforeAutospacing="0" w:after="240" w:afterAutospacing="0"/>
+        <w:jc w:val="both"/>
+        <w:rPr>
+          <w:color w:val="000000"/>
+        </w:rPr>
+      </w:pPr>
+      <w:r>
+        <w:rPr>
+          <w:color w:val="000000"/>
+        </w:rPr>
+        <w:t xml:space="preserve">Por otra parte, el componente de </w:t>
+      </w:r>
+      <w:proofErr w:type="spellStart"/>
+      <w:r>
+        <w:rPr>
+          <w:color w:val="000000"/>
+        </w:rPr>
+        <w:t>forecasting</w:t>
+      </w:r>
+      <w:proofErr w:type="spellEnd"/>
+      <w:r>
+        <w:rPr>
+          <w:color w:val="000000"/>
+        </w:rPr>
+        <w:t xml:space="preserve"> permitió proyectar el comportamiento futuro de las ventas mediante técnicas de series de tiempo y tendencia, proporcionando una herramienta útil para anticipar escenarios comerciales futuros. Finalmente, el </w:t>
+      </w:r>
+      <w:proofErr w:type="spellStart"/>
+      <w:r>
+        <w:rPr>
+          <w:color w:val="000000"/>
+        </w:rPr>
+        <w:t>dashboard</w:t>
+      </w:r>
+      <w:proofErr w:type="spellEnd"/>
+      <w:r>
+        <w:rPr>
+          <w:color w:val="000000"/>
+        </w:rPr>
+        <w:t xml:space="preserve"> interactivo desarrollado en </w:t>
+      </w:r>
+      <w:proofErr w:type="spellStart"/>
+      <w:r>
+        <w:rPr>
+          <w:color w:val="000000"/>
+        </w:rPr>
+        <w:t>Shiny</w:t>
+      </w:r>
+      <w:proofErr w:type="spellEnd"/>
+      <w:r>
+        <w:rPr>
+          <w:color w:val="000000"/>
+        </w:rPr>
+        <w:t xml:space="preserve"> permitió integrar los resultados estadísticos, gráficos y proyecciones en una plataforma visual e interactiva, facilitando la interpretación de resultados complejos y apoyando la toma de decisiones estratégicas basadas en datos dentro del sector moda.</w:t>
+      </w:r>
+    </w:p>
+    <w:p>
+      <w:pPr>
+        <w:pStyle w:val="Ttulo2"/>
+        <w:spacing w:before="360"/>
+        <w:jc w:val="both"/>
+        <w:rPr>
+          <w:rFonts w:ascii="Times New Roman" w:hAnsi="Times New Roman" w:cs="Times New Roman"/>
+          <w:b/>
+          <w:bCs/>
+          <w:lang w:eastAsia="en-US"/>
+        </w:rPr>
+      </w:pPr>
+      <w:r>
+        <w:rPr>
+          <w:rFonts w:ascii="Times New Roman" w:hAnsi="Times New Roman" w:cs="Times New Roman"/>
+          <w:b/>
+          <w:bCs/>
+          <w:color w:val="000000"/>
+          <w:sz w:val="24"/>
+          <w:szCs w:val="24"/>
+        </w:rPr>
+        <w:t>11. Recomendaciones Estratégicas</w:t>
+      </w:r>
+    </w:p>
+    <w:p>
+      <w:pPr>
+        <w:pStyle w:val="NormalWeb"/>
+        <w:spacing w:before="240" w:beforeAutospacing="0" w:after="240" w:afterAutospacing="0"/>
+        <w:jc w:val="both"/>
+      </w:pPr>
+      <w:r>
+        <w:rPr>
+          <w:color w:val="000000"/>
+        </w:rPr>
+        <w:t xml:space="preserve">A partir de los hallazgos obtenidos en el modelo econométrico y el análisis predictivo, se pueden establecer diversas recomendaciones estratégicas orientadas a optimizar el desempeño comercial de la empresa. En primer lugar, se recomienda implementar estrategias de </w:t>
+      </w:r>
+      <w:proofErr w:type="spellStart"/>
+      <w:r>
+        <w:rPr>
+          <w:i/>
+          <w:iCs/>
+          <w:color w:val="000000"/>
+        </w:rPr>
+        <w:t>pricing</w:t>
+      </w:r>
+      <w:proofErr w:type="spellEnd"/>
+      <w:r>
+        <w:rPr>
+          <w:i/>
+          <w:iCs/>
+          <w:color w:val="000000"/>
+        </w:rPr>
+        <w:t xml:space="preserve"> dinámico</w:t>
+      </w:r>
+      <w:r>
+        <w:rPr>
+          <w:color w:val="000000"/>
+        </w:rPr>
+        <w:t>, ajustando los precios de acuerdo con la sensibilidad de demanda identificada en cada categoría de producto. Dado el alto nivel de elasticidad encontrado, reducciones moderadas en precio podrían traducirse en incrementos proporcionales importantes en el volumen de ventas y en la rotación de inventario.</w:t>
+      </w:r>
+    </w:p>
+    <w:p>
+      <w:pPr>
+        <w:pStyle w:val="NormalWeb"/>
+        <w:spacing w:before="240" w:beforeAutospacing="0" w:after="240" w:afterAutospacing="0"/>
+        <w:jc w:val="both"/>
+      </w:pPr>
+      <w:r>
+        <w:rPr>
+          <w:color w:val="000000"/>
+        </w:rPr>
+        <w:t xml:space="preserve">Asimismo, se sugiere focalizar promociones y campañas de descuento en categorías con mayor sensibilidad al precio, especialmente en líneas como </w:t>
+      </w:r>
+      <w:r>
+        <w:rPr>
+          <w:i/>
+          <w:iCs/>
+          <w:color w:val="000000"/>
+        </w:rPr>
+        <w:t>tops</w:t>
+      </w:r>
+      <w:r>
+        <w:rPr>
+          <w:color w:val="000000"/>
+        </w:rPr>
+        <w:t xml:space="preserve"> y </w:t>
+      </w:r>
+      <w:r>
+        <w:rPr>
+          <w:i/>
+          <w:iCs/>
+          <w:color w:val="000000"/>
+        </w:rPr>
+        <w:t>t-</w:t>
+      </w:r>
+      <w:proofErr w:type="spellStart"/>
+      <w:r>
+        <w:rPr>
+          <w:i/>
+          <w:iCs/>
+          <w:color w:val="000000"/>
+        </w:rPr>
+        <w:t>shirts</w:t>
+      </w:r>
+      <w:proofErr w:type="spellEnd"/>
+      <w:r>
+        <w:rPr>
+          <w:color w:val="000000"/>
+        </w:rPr>
+        <w:t>, donde los consumidores parecen responder con mayor intensidad a cambios en precios. Este tipo de estrategias podría aumentar el tráfico, estimular compras impulsivas y mejorar el desempeño de categorías con menor dinamismo comercial.</w:t>
+      </w:r>
+    </w:p>
+    <w:p>
+      <w:pPr>
+        <w:pStyle w:val="NormalWeb"/>
+        <w:spacing w:before="240" w:beforeAutospacing="0" w:after="240" w:afterAutospacing="0"/>
+        <w:jc w:val="both"/>
+      </w:pPr>
+      <w:r>
+        <w:rPr>
+          <w:color w:val="000000"/>
+        </w:rPr>
+        <w:t xml:space="preserve">En relación con las marcas, resulta recomendable realizar un análisis más profundo sobre el desempeño de </w:t>
+      </w:r>
+      <w:r>
+        <w:rPr>
+          <w:i/>
+          <w:iCs/>
+          <w:color w:val="000000"/>
+        </w:rPr>
+        <w:t>Brand_4</w:t>
+      </w:r>
+      <w:r>
+        <w:rPr>
+          <w:color w:val="000000"/>
+        </w:rPr>
+        <w:t>, cuyo impacto negativo sobre las ventas podría estar asociado a problemas de posicionamiento, diferenciación, percepción de calidad o estrategias de comunicación insuficientes. La empresa podría evaluar acciones relacionadas con branding, campañas de marketing, rediseño de producto o ajustes en precios para fortalecer la competitividad de esta marca dentro del mercado.</w:t>
+      </w:r>
+    </w:p>
+    <w:p>
+      <w:pPr>
+        <w:pStyle w:val="NormalWeb"/>
+        <w:spacing w:before="240" w:beforeAutospacing="0" w:after="240" w:afterAutospacing="0"/>
+        <w:jc w:val="both"/>
+      </w:pPr>
+      <w:r>
+        <w:rPr>
+          <w:color w:val="000000"/>
+        </w:rPr>
+        <w:lastRenderedPageBreak/>
+        <w:t xml:space="preserve">Adicionalmente, el modelo desarrollado puede convertirse en una herramienta de apoyo para la planeación estratégica y la toma de decisiones futuras. Gracias a la estimación de elasticidades y al sistema de </w:t>
+      </w:r>
+      <w:proofErr w:type="spellStart"/>
+      <w:r>
+        <w:rPr>
+          <w:color w:val="000000"/>
+        </w:rPr>
+        <w:t>forecasting</w:t>
+      </w:r>
+      <w:proofErr w:type="spellEnd"/>
+      <w:r>
+        <w:rPr>
+          <w:color w:val="000000"/>
+        </w:rPr>
+        <w:t xml:space="preserve"> implementado, la empresa puede simular distintos escenarios comerciales, incluyendo descuentos temporales, aumentos de precios, cambios en el portafolio, lanzamientos de nuevos productos y variaciones en costos. Esto permite adoptar una gestión más predictiva y basada en analítica de datos, reduciendo la incertidumbre y mejorando la eficiencia en las decisiones comerciales y financieras.</w:t>
+      </w:r>
+    </w:p>
+    <w:p>
+      <w:pPr>
+        <w:pStyle w:val="NormalWeb"/>
+        <w:spacing w:before="240" w:beforeAutospacing="0" w:after="240" w:afterAutospacing="0"/>
+        <w:jc w:val="both"/>
+      </w:pPr>
+    </w:p>
+    <w:p>
+      <w:pPr>
+        <w:pStyle w:val="NormalWeb"/>
+        <w:spacing w:before="240" w:beforeAutospacing="0" w:after="240" w:afterAutospacing="0"/>
+        <w:jc w:val="both"/>
+      </w:pPr>
+    </w:p>
+    <w:p>
+      <w:pPr>
+        <w:pStyle w:val="NormalWeb"/>
+        <w:spacing w:before="240" w:beforeAutospacing="0" w:after="240" w:afterAutospacing="0"/>
+        <w:jc w:val="both"/>
+      </w:pPr>
+    </w:p>
+    <w:p>
+      <w:pPr>
+        <w:pStyle w:val="NormalWeb"/>
+        <w:spacing w:before="240" w:beforeAutospacing="0" w:after="240" w:afterAutospacing="0"/>
+        <w:jc w:val="both"/>
+      </w:pPr>
+    </w:p>
+    <w:p>
+      <w:pPr>
+        <w:pStyle w:val="NormalWeb"/>
+        <w:spacing w:before="240" w:beforeAutospacing="0" w:after="240" w:afterAutospacing="0"/>
+        <w:jc w:val="both"/>
+        <w:rPr>
+          <w:color w:val="000000"/>
+        </w:rPr>
+      </w:pPr>
+    </w:p>
+    <w:p>
+      <w:pPr>
+        <w:pStyle w:val="NormalWeb"/>
+        <w:spacing w:before="240" w:beforeAutospacing="0" w:after="240" w:afterAutospacing="0"/>
+        <w:jc w:val="both"/>
+      </w:pPr>
+    </w:p>
+    <w:p>
+      <w:pPr>
         <w:spacing w:before="240" w:after="240"/>
         <w:jc w:val="both"/>
       </w:pPr>
-      <w:r>
-        <w:rPr>
-          <w:color w:val="000000"/>
-        </w:rPr>
-        <w:t>Como se mencionó, la marca Brand_4 presenta un efecto negativo significativo sobre las ventas. Esto podría estar asociado a problemas de posicionamiento, menor percepción de calidad, estrategias de marketing poco efectivas, menor reconocimiento de marca y/o precios poco competitivos. Siendo así, el resultado evidencia una posible desventaja competitiva frente a las demás marcas analizadas.</w:t>
-      </w:r>
     </w:p>
     <w:p/>
     <w:p/>
@@ -2702,7 +4397,7 @@
 </file>
 
 <file path=word/numbering.xml><?xml version="1.0" encoding="utf-8"?>
-<w:numbering xmlns:wpc="http://schemas.microsoft.com/office/word/2010/wordprocessingCanvas" xmlns:cx="http://schemas.microsoft.com/office/drawing/2014/chartex" xmlns:cx1="http://schemas.microsoft.com/office/drawing/2015/9/8/chartex" xmlns:cx2="http://schemas.microsoft.com/office/drawing/2015/10/21/chartex" xmlns:cx3="http://schemas.microsoft.com/office/drawing/2016/5/9/chartex" xmlns:cx4="http://schemas.microsoft.com/office/drawing/2016/5/10/chartex" xmlns:cx5="http://schemas.microsoft.com/office/drawing/2016/5/11/chartex" xmlns:cx6="http://schemas.microsoft.com/office/drawing/2016/5/12/chartex" xmlns:cx7="http://schemas.microsoft.com/office/drawing/2016/5/13/chartex" xmlns:cx8="http://schemas.microsoft.com/office/drawing/2016/5/14/chartex" xmlns:mc="http://schemas.openxmlformats.org/markup-compatibility/2006" xmlns:aink="http://schemas.microsoft.com/office/drawing/2016/ink" xmlns:am3d="http://schemas.microsoft.com/office/drawing/2017/model3d" xmlns:o="urn:schemas-microsoft-com:office:office" xmlns:oel="http://schemas.microsoft.com/office/2019/extlst" xmlns:r="http://schemas.openxmlformats.org/officeDocument/2006/relationships" xmlns:m="http://schemas.openxmlformats.org/officeDocument/2006/math" xmlns:v="urn:schemas-microsoft-com:vml" xmlns:wp14="http://schemas.microsoft.com/office/word/2010/wordprocessingDrawing" xmlns:wp="http://schemas.openxmlformats.org/drawingml/2006/wordprocessingDrawing" xmlns:w10="urn:schemas-microsoft-com:office:word" xmlns:w="http://schemas.openxmlformats.org/wordprocessingml/2006/main" xmlns:w14="http://schemas.microsoft.com/office/word/2010/wordml" xmlns:w15="http://schemas.microsoft.com/office/word/2012/wordml" xmlns:w16cex="http://schemas.microsoft.com/office/word/2018/wordml/cex" xmlns:w16cid="http://schemas.microsoft.com/office/word/2016/wordml/cid" xmlns:w16="http://schemas.microsoft.com/office/word/2018/wordml" xmlns:w16du="http://schemas.microsoft.com/office/word/2023/wordml/word16du" xmlns:w16sdtdh="http://schemas.microsoft.com/office/word/2020/wordml/sdtdatahash" xmlns:w16sdtfl="http://schemas.microsoft.com/office/word/2024/wordml/sdtformatlock" xmlns:w16se="http://schemas.microsoft.com/office/word/2015/wordml/symex" xmlns:wpg="http://schemas.microsoft.com/office/word/2010/wordprocessingGroup" xmlns:wpi="http://schemas.microsoft.com/office/word/2010/wordprocessingInk" xmlns:wne="http://schemas.microsoft.com/office/word/2006/wordml" xmlns:wps="http://schemas.microsoft.com/office/word/2010/wordprocessingShape" mc:Ignorable="w14 w15 w16se w16cid w16 w16cex w16sdtdh w16sdtfl w16du wp14">
+<w:numbering xmlns:wpc="http://schemas.microsoft.com/office/word/2010/wordprocessingCanvas" xmlns:cx="http://schemas.microsoft.com/office/drawing/2014/chartex" xmlns:cx1="http://schemas.microsoft.com/office/drawing/2015/9/8/chartex" xmlns:cx2="http://schemas.microsoft.com/office/drawing/2015/10/21/chartex" xmlns:cx3="http://schemas.microsoft.com/office/drawing/2016/5/9/chartex" xmlns:cx4="http://schemas.microsoft.com/office/drawing/2016/5/10/chartex" xmlns:cx5="http://schemas.microsoft.com/office/drawing/2016/5/11/chartex" xmlns:cx6="http://schemas.microsoft.com/office/drawing/2016/5/12/chartex" xmlns:cx7="http://schemas.microsoft.com/office/drawing/2016/5/13/chartex" xmlns:cx8="http://schemas.microsoft.com/office/drawing/2016/5/14/chartex" xmlns:mc="http://schemas.openxmlformats.org/markup-compatibility/2006" xmlns:aink="http://schemas.microsoft.com/office/drawing/2016/ink" xmlns:am3d="http://schemas.microsoft.com/office/drawing/2017/model3d" xmlns:o="urn:schemas-microsoft-com:office:office" xmlns:r="http://schemas.openxmlformats.org/officeDocument/2006/relationships" xmlns:m="http://schemas.openxmlformats.org/officeDocument/2006/math" xmlns:v="urn:schemas-microsoft-com:vml" xmlns:wp14="http://schemas.microsoft.com/office/word/2010/wordprocessingDrawing" xmlns:wp="http://schemas.openxmlformats.org/drawingml/2006/wordprocessingDrawing" xmlns:w10="urn:schemas-microsoft-com:office:word" xmlns:w="http://schemas.openxmlformats.org/wordprocessingml/2006/main" xmlns:w14="http://schemas.microsoft.com/office/word/2010/wordml" xmlns:w15="http://schemas.microsoft.com/office/word/2012/wordml" xmlns:w16cex="http://schemas.microsoft.com/office/word/2018/wordml/cex" xmlns:w16cid="http://schemas.microsoft.com/office/word/2016/wordml/cid" xmlns:w16="http://schemas.microsoft.com/office/word/2018/wordml" xmlns:w16se="http://schemas.microsoft.com/office/word/2015/wordml/symex" xmlns:wpg="http://schemas.microsoft.com/office/word/2010/wordprocessingGroup" xmlns:wpi="http://schemas.microsoft.com/office/word/2010/wordprocessingInk" xmlns:wne="http://schemas.microsoft.com/office/word/2006/wordml" xmlns:wps="http://schemas.microsoft.com/office/word/2010/wordprocessingShape" mc:Ignorable="w14 w15 w16se w16cid w16 w16cex wp14">
   <w:abstractNum w:abstractNumId="0" w15:restartNumberingAfterBreak="0">
     <w:nsid w:val="0D6514A4"/>
     <w:multiLevelType w:val="multilevel"/>
@@ -3413,6 +5108,119 @@
     </w:lvl>
   </w:abstractNum>
   <w:abstractNum w:abstractNumId="5" w15:restartNumberingAfterBreak="0">
+    <w:nsid w:val="5FCF46B7"/>
+    <w:multiLevelType w:val="multilevel"/>
+    <w:tmpl w:val="38940D00"/>
+    <w:lvl w:ilvl="0">
+      <w:start w:val="1"/>
+      <w:numFmt w:val="decimal"/>
+      <w:lvlText w:val="%1."/>
+      <w:lvlJc w:val="left"/>
+      <w:pPr>
+        <w:tabs>
+          <w:tab w:val="num" w:pos="720"/>
+        </w:tabs>
+        <w:ind w:left="720" w:hanging="360"/>
+      </w:pPr>
+    </w:lvl>
+    <w:lvl w:ilvl="1" w:tentative="1">
+      <w:start w:val="1"/>
+      <w:numFmt w:val="decimal"/>
+      <w:lvlText w:val="%2."/>
+      <w:lvlJc w:val="left"/>
+      <w:pPr>
+        <w:tabs>
+          <w:tab w:val="num" w:pos="1440"/>
+        </w:tabs>
+        <w:ind w:left="1440" w:hanging="360"/>
+      </w:pPr>
+    </w:lvl>
+    <w:lvl w:ilvl="2" w:tentative="1">
+      <w:start w:val="1"/>
+      <w:numFmt w:val="decimal"/>
+      <w:lvlText w:val="%3."/>
+      <w:lvlJc w:val="left"/>
+      <w:pPr>
+        <w:tabs>
+          <w:tab w:val="num" w:pos="2160"/>
+        </w:tabs>
+        <w:ind w:left="2160" w:hanging="360"/>
+      </w:pPr>
+    </w:lvl>
+    <w:lvl w:ilvl="3" w:tentative="1">
+      <w:start w:val="1"/>
+      <w:numFmt w:val="decimal"/>
+      <w:lvlText w:val="%4."/>
+      <w:lvlJc w:val="left"/>
+      <w:pPr>
+        <w:tabs>
+          <w:tab w:val="num" w:pos="2880"/>
+        </w:tabs>
+        <w:ind w:left="2880" w:hanging="360"/>
+      </w:pPr>
+    </w:lvl>
+    <w:lvl w:ilvl="4" w:tentative="1">
+      <w:start w:val="1"/>
+      <w:numFmt w:val="decimal"/>
+      <w:lvlText w:val="%5."/>
+      <w:lvlJc w:val="left"/>
+      <w:pPr>
+        <w:tabs>
+          <w:tab w:val="num" w:pos="3600"/>
+        </w:tabs>
+        <w:ind w:left="3600" w:hanging="360"/>
+      </w:pPr>
+    </w:lvl>
+    <w:lvl w:ilvl="5" w:tentative="1">
+      <w:start w:val="1"/>
+      <w:numFmt w:val="decimal"/>
+      <w:lvlText w:val="%6."/>
+      <w:lvlJc w:val="left"/>
+      <w:pPr>
+        <w:tabs>
+          <w:tab w:val="num" w:pos="4320"/>
+        </w:tabs>
+        <w:ind w:left="4320" w:hanging="360"/>
+      </w:pPr>
+    </w:lvl>
+    <w:lvl w:ilvl="6" w:tentative="1">
+      <w:start w:val="1"/>
+      <w:numFmt w:val="decimal"/>
+      <w:lvlText w:val="%7."/>
+      <w:lvlJc w:val="left"/>
+      <w:pPr>
+        <w:tabs>
+          <w:tab w:val="num" w:pos="5040"/>
+        </w:tabs>
+        <w:ind w:left="5040" w:hanging="360"/>
+      </w:pPr>
+    </w:lvl>
+    <w:lvl w:ilvl="7" w:tentative="1">
+      <w:start w:val="1"/>
+      <w:numFmt w:val="decimal"/>
+      <w:lvlText w:val="%8."/>
+      <w:lvlJc w:val="left"/>
+      <w:pPr>
+        <w:tabs>
+          <w:tab w:val="num" w:pos="5760"/>
+        </w:tabs>
+        <w:ind w:left="5760" w:hanging="360"/>
+      </w:pPr>
+    </w:lvl>
+    <w:lvl w:ilvl="8" w:tentative="1">
+      <w:start w:val="1"/>
+      <w:numFmt w:val="decimal"/>
+      <w:lvlText w:val="%9."/>
+      <w:lvlJc w:val="left"/>
+      <w:pPr>
+        <w:tabs>
+          <w:tab w:val="num" w:pos="6480"/>
+        </w:tabs>
+        <w:ind w:left="6480" w:hanging="360"/>
+      </w:pPr>
+    </w:lvl>
+  </w:abstractNum>
+  <w:abstractNum w:abstractNumId="6" w15:restartNumberingAfterBreak="0">
     <w:nsid w:val="600C694E"/>
     <w:multiLevelType w:val="multilevel"/>
     <w:tmpl w:val="345C3B72"/>
@@ -3561,7 +5369,7 @@
       </w:rPr>
     </w:lvl>
   </w:abstractNum>
-  <w:abstractNum w:abstractNumId="6" w15:restartNumberingAfterBreak="0">
+  <w:abstractNum w:abstractNumId="7" w15:restartNumberingAfterBreak="0">
     <w:nsid w:val="67240A34"/>
     <w:multiLevelType w:val="multilevel"/>
     <w:tmpl w:val="348C4E22"/>
@@ -3710,32 +5518,35 @@
       </w:rPr>
     </w:lvl>
   </w:abstractNum>
-  <w:num w:numId="1" w16cid:durableId="363023352">
+  <w:num w:numId="1">
     <w:abstractNumId w:val="2"/>
   </w:num>
-  <w:num w:numId="2" w16cid:durableId="951858285">
+  <w:num w:numId="2">
     <w:abstractNumId w:val="1"/>
   </w:num>
-  <w:num w:numId="3" w16cid:durableId="2091005357">
+  <w:num w:numId="3">
+    <w:abstractNumId w:val="7"/>
+  </w:num>
+  <w:num w:numId="4">
     <w:abstractNumId w:val="6"/>
   </w:num>
-  <w:num w:numId="4" w16cid:durableId="196509368">
-    <w:abstractNumId w:val="5"/>
-  </w:num>
-  <w:num w:numId="5" w16cid:durableId="1762025039">
+  <w:num w:numId="5">
     <w:abstractNumId w:val="4"/>
   </w:num>
-  <w:num w:numId="6" w16cid:durableId="668368146">
+  <w:num w:numId="6">
     <w:abstractNumId w:val="0"/>
   </w:num>
-  <w:num w:numId="7" w16cid:durableId="1177845322">
+  <w:num w:numId="7">
     <w:abstractNumId w:val="3"/>
+  </w:num>
+  <w:num w:numId="8">
+    <w:abstractNumId w:val="5"/>
   </w:num>
 </w:numbering>
 </file>
 
 <file path=word/styles.xml><?xml version="1.0" encoding="utf-8"?>
-<w:styles xmlns:mc="http://schemas.openxmlformats.org/markup-compatibility/2006" xmlns:r="http://schemas.openxmlformats.org/officeDocument/2006/relationships" xmlns:w="http://schemas.openxmlformats.org/wordprocessingml/2006/main" xmlns:w14="http://schemas.microsoft.com/office/word/2010/wordml" xmlns:w15="http://schemas.microsoft.com/office/word/2012/wordml" xmlns:w16cex="http://schemas.microsoft.com/office/word/2018/wordml/cex" xmlns:w16cid="http://schemas.microsoft.com/office/word/2016/wordml/cid" xmlns:w16="http://schemas.microsoft.com/office/word/2018/wordml" xmlns:w16du="http://schemas.microsoft.com/office/word/2023/wordml/word16du" xmlns:w16sdtdh="http://schemas.microsoft.com/office/word/2020/wordml/sdtdatahash" xmlns:w16sdtfl="http://schemas.microsoft.com/office/word/2024/wordml/sdtformatlock" xmlns:w16se="http://schemas.microsoft.com/office/word/2015/wordml/symex" mc:Ignorable="w14 w15 w16se w16cid w16 w16cex w16sdtdh w16sdtfl w16du">
+<w:styles xmlns:mc="http://schemas.openxmlformats.org/markup-compatibility/2006" xmlns:r="http://schemas.openxmlformats.org/officeDocument/2006/relationships" xmlns:w="http://schemas.openxmlformats.org/wordprocessingml/2006/main" xmlns:w14="http://schemas.microsoft.com/office/word/2010/wordml" xmlns:w15="http://schemas.microsoft.com/office/word/2012/wordml" xmlns:w16cex="http://schemas.microsoft.com/office/word/2018/wordml/cex" xmlns:w16cid="http://schemas.microsoft.com/office/word/2016/wordml/cid" xmlns:w16="http://schemas.microsoft.com/office/word/2018/wordml" xmlns:w16se="http://schemas.microsoft.com/office/word/2015/wordml/symex" mc:Ignorable="w14 w15 w16se w16cid w16 w16cex">
   <w:docDefaults>
     <w:rPrDefault>
       <w:rPr>
@@ -4667,6 +6478,18 @@
       <w:spacing w:before="100" w:beforeAutospacing="1" w:after="100" w:afterAutospacing="1"/>
     </w:pPr>
   </w:style>
+  <w:style w:type="character" w:styleId="Hipervnculo">
+    <w:name w:val="Hyperlink"/>
+    <w:basedOn w:val="Fuentedeprrafopredeter"/>
+    <w:uiPriority w:val="99"/>
+    <w:semiHidden/>
+    <w:unhideWhenUsed/>
+    <w:rsid w:val="000110AB"/>
+    <w:rPr>
+      <w:color w:val="0000FF"/>
+      <w:u w:val="single"/>
+    </w:rPr>
+  </w:style>
 </w:styles>
 </file>
 

</xml_diff>